<commit_message>
Add UML-style process/sequence diagrams to all 3 case studies (web pages + docx files)
</commit_message>
<xml_diff>
--- a/Project1_Credit_Risk_Case_Study.docx
+++ b/Project1_Credit_Risk_Case_Study.docx
@@ -511,7 +511,7 @@
         <w:spacing w:after="150" w:before="300"/>
       </w:pPr>
       <w:r>
-        <w:t xml:space="preserve">4. Prototype &amp; Evaluation (MVP)</w:t>
+        <w:t xml:space="preserve">4. Data &amp; Process Flow Diagrams</w:t>
       </w:r>
     </w:p>
     <w:p>
@@ -519,362 +519,7 @@
         <w:spacing w:after="120"/>
       </w:pPr>
       <w:r>
-        <w:t xml:space="preserve">A synthetic dataset (8,000 records, ~14.8% base default rate) was generated to mirror the attributes above, and a baseline logistic regression scoring model was built to validate the analytical approach before proposing it to the AI Engineering team for a production-grade model (e.g., gradient boosting on Databricks/SageMaker).</w:t>
-      </w:r>
-    </w:p>
-    <w:tbl>
-      <w:tblPr>
-        <w:tblW w:type="dxa" w:w="11000"/>
-        <w:tblBorders>
-          <w:top w:val="single" w:color="auto" w:sz="4"/>
-          <w:left w:val="single" w:color="auto" w:sz="4"/>
-          <w:bottom w:val="single" w:color="auto" w:sz="4"/>
-          <w:right w:val="single" w:color="auto" w:sz="4"/>
-          <w:insideH w:val="single" w:color="auto" w:sz="4"/>
-          <w:insideV w:val="single" w:color="auto" w:sz="4"/>
-        </w:tblBorders>
-      </w:tblPr>
-      <w:tblGrid>
-        <w:gridCol w:w="2600"/>
-        <w:gridCol w:w="2600"/>
-        <w:gridCol w:w="5800"/>
-      </w:tblGrid>
-      <w:tr>
-        <w:tc>
-          <w:tcPr>
-            <w:tcW w:type="dxa" w:w="2600"/>
-            <w:shd w:fill="1F2A44" w:val="clear"/>
-          </w:tcPr>
-          <w:p>
-            <w:r>
-              <w:rPr>
-                <w:b/>
-                <w:bCs/>
-                <w:color w:val="FFFFFF"/>
-                <w:sz w:val="20"/>
-                <w:szCs w:val="20"/>
-              </w:rPr>
-              <w:t xml:space="preserve">Metric</w:t>
-            </w:r>
-          </w:p>
-        </w:tc>
-        <w:tc>
-          <w:tcPr>
-            <w:tcW w:type="dxa" w:w="2600"/>
-            <w:shd w:fill="1F2A44" w:val="clear"/>
-          </w:tcPr>
-          <w:p>
-            <w:r>
-              <w:rPr>
-                <w:b/>
-                <w:bCs/>
-                <w:color w:val="FFFFFF"/>
-                <w:sz w:val="20"/>
-                <w:szCs w:val="20"/>
-              </w:rPr>
-              <w:t xml:space="preserve">Result</w:t>
-            </w:r>
-          </w:p>
-        </w:tc>
-        <w:tc>
-          <w:tcPr>
-            <w:tcW w:type="dxa" w:w="5800"/>
-            <w:shd w:fill="1F2A44" w:val="clear"/>
-          </w:tcPr>
-          <w:p>
-            <w:r>
-              <w:rPr>
-                <w:b/>
-                <w:bCs/>
-                <w:color w:val="FFFFFF"/>
-                <w:sz w:val="20"/>
-                <w:szCs w:val="20"/>
-              </w:rPr>
-              <w:t xml:space="preserve">Business interpretation</w:t>
-            </w:r>
-          </w:p>
-        </w:tc>
-      </w:tr>
-      <w:tr>
-        <w:tc>
-          <w:tcPr>
-            <w:tcW w:type="dxa" w:w="2600"/>
-          </w:tcPr>
-          <w:p>
-            <w:r>
-              <w:rPr>
-                <w:b w:val="false"/>
-                <w:bCs w:val="false"/>
-                <w:sz w:val="20"/>
-                <w:szCs w:val="20"/>
-              </w:rPr>
-              <w:t xml:space="preserve">AUC (test set)</w:t>
-            </w:r>
-          </w:p>
-        </w:tc>
-        <w:tc>
-          <w:tcPr>
-            <w:tcW w:type="dxa" w:w="2600"/>
-          </w:tcPr>
-          <w:p>
-            <w:r>
-              <w:rPr>
-                <w:b w:val="false"/>
-                <w:bCs w:val="false"/>
-                <w:sz w:val="20"/>
-                <w:szCs w:val="20"/>
-              </w:rPr>
-              <w:t xml:space="preserve">0.6742</w:t>
-            </w:r>
-          </w:p>
-        </w:tc>
-        <w:tc>
-          <w:tcPr>
-            <w:tcW w:type="dxa" w:w="5800"/>
-          </w:tcPr>
-          <w:p>
-            <w:r>
-              <w:rPr>
-                <w:b w:val="false"/>
-                <w:bCs w:val="false"/>
-                <w:sz w:val="20"/>
-                <w:szCs w:val="20"/>
-              </w:rPr>
-              <w:t xml:space="preserve">Model ranks risk meaningfully better than random (0.5); acceptable for an MVP baseline, expected to improve with real data + richer features</w:t>
-            </w:r>
-          </w:p>
-        </w:tc>
-      </w:tr>
-      <w:tr>
-        <w:tc>
-          <w:tcPr>
-            <w:tcW w:type="dxa" w:w="2600"/>
-          </w:tcPr>
-          <w:p>
-            <w:r>
-              <w:rPr>
-                <w:b w:val="false"/>
-                <w:bCs w:val="false"/>
-                <w:sz w:val="20"/>
-                <w:szCs w:val="20"/>
-              </w:rPr>
-              <w:t xml:space="preserve">Review threshold</w:t>
-            </w:r>
-          </w:p>
-        </w:tc>
-        <w:tc>
-          <w:tcPr>
-            <w:tcW w:type="dxa" w:w="2600"/>
-          </w:tcPr>
-          <w:p>
-            <w:r>
-              <w:rPr>
-                <w:b w:val="false"/>
-                <w:bCs w:val="false"/>
-                <w:sz w:val="20"/>
-                <w:szCs w:val="20"/>
-              </w:rPr>
-              <w:t xml:space="preserve">Top 15% of scores</w:t>
-            </w:r>
-          </w:p>
-        </w:tc>
-        <w:tc>
-          <w:tcPr>
-            <w:tcW w:type="dxa" w:w="5800"/>
-          </w:tcPr>
-          <w:p>
-            <w:r>
-              <w:rPr>
-                <w:b w:val="false"/>
-                <w:bCs w:val="false"/>
-                <w:sz w:val="20"/>
-                <w:szCs w:val="20"/>
-              </w:rPr>
-              <w:t xml:space="preserve">Sized to match credit ops' current manual-review capacity</w:t>
-            </w:r>
-          </w:p>
-        </w:tc>
-      </w:tr>
-      <w:tr>
-        <w:tc>
-          <w:tcPr>
-            <w:tcW w:type="dxa" w:w="2600"/>
-          </w:tcPr>
-          <w:p>
-            <w:r>
-              <w:rPr>
-                <w:b w:val="false"/>
-                <w:bCs w:val="false"/>
-                <w:sz w:val="20"/>
-                <w:szCs w:val="20"/>
-              </w:rPr>
-              <w:t xml:space="preserve">Precision (flagged)</w:t>
-            </w:r>
-          </w:p>
-        </w:tc>
-        <w:tc>
-          <w:tcPr>
-            <w:tcW w:type="dxa" w:w="2600"/>
-          </w:tcPr>
-          <w:p>
-            <w:r>
-              <w:rPr>
-                <w:b w:val="false"/>
-                <w:bCs w:val="false"/>
-                <w:sz w:val="20"/>
-                <w:szCs w:val="20"/>
-              </w:rPr>
-              <w:t xml:space="preserve">0.29</w:t>
-            </w:r>
-          </w:p>
-        </w:tc>
-        <w:tc>
-          <w:tcPr>
-            <w:tcW w:type="dxa" w:w="5800"/>
-          </w:tcPr>
-          <w:p>
-            <w:r>
-              <w:rPr>
-                <w:b w:val="false"/>
-                <w:bCs w:val="false"/>
-                <w:sz w:val="20"/>
-                <w:szCs w:val="20"/>
-              </w:rPr>
-              <w:t xml:space="preserve">~29% of flagged cases are true defaulters — informs expected 'false alarm' rate for ops planning</w:t>
-            </w:r>
-          </w:p>
-        </w:tc>
-      </w:tr>
-      <w:tr>
-        <w:tc>
-          <w:tcPr>
-            <w:tcW w:type="dxa" w:w="2600"/>
-          </w:tcPr>
-          <w:p>
-            <w:r>
-              <w:rPr>
-                <w:b w:val="false"/>
-                <w:bCs w:val="false"/>
-                <w:sz w:val="20"/>
-                <w:szCs w:val="20"/>
-              </w:rPr>
-              <w:t xml:space="preserve">Recall (flagged)</w:t>
-            </w:r>
-          </w:p>
-        </w:tc>
-        <w:tc>
-          <w:tcPr>
-            <w:tcW w:type="dxa" w:w="2600"/>
-          </w:tcPr>
-          <w:p>
-            <w:r>
-              <w:rPr>
-                <w:b w:val="false"/>
-                <w:bCs w:val="false"/>
-                <w:sz w:val="20"/>
-                <w:szCs w:val="20"/>
-              </w:rPr>
-              <w:t xml:space="preserve">0.294</w:t>
-            </w:r>
-          </w:p>
-        </w:tc>
-        <w:tc>
-          <w:tcPr>
-            <w:tcW w:type="dxa" w:w="5800"/>
-          </w:tcPr>
-          <w:p>
-            <w:r>
-              <w:rPr>
-                <w:b w:val="false"/>
-                <w:bCs w:val="false"/>
-                <w:sz w:val="20"/>
-                <w:szCs w:val="20"/>
-              </w:rPr>
-              <w:t xml:space="preserve">~29% of actual defaulters are caught by the review queue at this threshold — a lever to negotiate with Risk (raise threshold = catch more, review more)</w:t>
-            </w:r>
-          </w:p>
-        </w:tc>
-      </w:tr>
-    </w:tbl>
-    <w:p>
-      <w:pPr>
-        <w:spacing w:after="120"/>
-      </w:pPr>
-      <w:r>
-        <w:t xml:space="preserve"/>
-      </w:r>
-    </w:p>
-    <w:p>
-      <w:pPr>
-        <w:spacing w:after="120"/>
-      </w:pPr>
-      <w:r>
-        <w:t xml:space="preserve">Key risk drivers (model coefficients, directional — for stakeholder explainability, not final production weights):</w:t>
-      </w:r>
-    </w:p>
-    <w:p>
-      <w:pPr>
-        <w:pStyle w:val="ListParagraph"/>
-        <w:numPr>
-          <w:ilvl w:val="0"/>
-          <w:numId w:val="2"/>
-        </w:numPr>
-        <w:spacing w:after="80"/>
-      </w:pPr>
-      <w:r>
-        <w:t xml:space="preserve">Debt-to-income ratio: +1.058 (strongest positive driver)</w:t>
-      </w:r>
-    </w:p>
-    <w:p>
-      <w:pPr>
-        <w:pStyle w:val="ListParagraph"/>
-        <w:numPr>
-          <w:ilvl w:val="0"/>
-          <w:numId w:val="2"/>
-        </w:numPr>
-        <w:spacing w:after="80"/>
-      </w:pPr>
-      <w:r>
-        <w:t xml:space="preserve">Credit utilization: +0.831</w:t>
-      </w:r>
-    </w:p>
-    <w:p>
-      <w:pPr>
-        <w:pStyle w:val="ListParagraph"/>
-        <w:numPr>
-          <w:ilvl w:val="0"/>
-          <w:numId w:val="2"/>
-        </w:numPr>
-        <w:spacing w:after="80"/>
-      </w:pPr>
-      <w:r>
-        <w:t xml:space="preserve">Late payments (12m): +0.492</w:t>
-      </w:r>
-    </w:p>
-    <w:p>
-      <w:pPr>
-        <w:pStyle w:val="ListParagraph"/>
-        <w:numPr>
-          <w:ilvl w:val="0"/>
-          <w:numId w:val="2"/>
-        </w:numPr>
-        <w:spacing w:after="80"/>
-      </w:pPr>
-      <w:r>
-        <w:t xml:space="preserve">Number of existing loans: +0.264</w:t>
-      </w:r>
-    </w:p>
-    <w:p>
-      <w:pPr>
-        <w:pStyle w:val="ListParagraph"/>
-        <w:numPr>
-          <w:ilvl w:val="0"/>
-          <w:numId w:val="2"/>
-        </w:numPr>
-        <w:spacing w:after="80"/>
-      </w:pPr>
-      <w:r>
-        <w:t xml:space="preserve">Monthly income: -0.126 (higher income associated with lower risk)</w:t>
+        <w:t xml:space="preserve">The diagram below shows how customer, bureau, and account-behavior data flow into the scoring model and into the credit officer's review queue; the sequence diagram details the step-by-step interaction between the application system, the scoring service, and the credit officer.</w:t>
       </w:r>
     </w:p>
     <w:p>
@@ -884,7 +529,7 @@
       <w:r>
         <w:drawing>
           <wp:inline distT="0" distB="0" distL="0" distR="0">
-            <wp:extent cx="4762500" cy="3057525"/>
+            <wp:extent cx="4572000" cy="3476625"/>
             <wp:effectExtent t="0" r="0" b="0" l="0"/>
             <wp:docPr id="1" name="" descr="" title=""/>
             <wp:cNvGraphicFramePr>
@@ -909,6 +554,498 @@
                   <pic:spPr bwMode="auto">
                     <a:xfrm>
                       <a:off x="0" y="0"/>
+                      <a:ext cx="4572000" cy="3476625"/>
+                    </a:xfrm>
+                    <a:prstGeom prst="rect">
+                      <a:avLst/>
+                    </a:prstGeom>
+                  </pic:spPr>
+                </pic:pic>
+              </a:graphicData>
+            </a:graphic>
+          </wp:inline>
+        </w:drawing>
+      </w:r>
+    </w:p>
+    <w:p>
+      <w:pPr>
+        <w:spacing w:after="120"/>
+      </w:pPr>
+      <w:r>
+        <w:rPr>
+          <w:i/>
+          <w:iCs/>
+          <w:color w:val="666666"/>
+          <w:sz w:val="18"/>
+          <w:szCs w:val="18"/>
+        </w:rPr>
+        <w:t xml:space="preserve">Figure 1. Data &amp; process flow diagram.</w:t>
+      </w:r>
+    </w:p>
+    <w:p>
+      <w:pPr>
+        <w:spacing w:after="100" w:before="200"/>
+      </w:pPr>
+      <w:r>
+        <w:drawing>
+          <wp:inline distT="0" distB="0" distL="0" distR="0">
+            <wp:extent cx="4572000" cy="3981450"/>
+            <wp:effectExtent t="0" r="0" b="0" l="0"/>
+            <wp:docPr id="1" name="" descr="" title=""/>
+            <wp:cNvGraphicFramePr>
+              <a:graphicFrameLocks xmlns:a="http://schemas.openxmlformats.org/drawingml/2006/main" noChangeAspect="1"/>
+            </wp:cNvGraphicFramePr>
+            <a:graphic xmlns:a="http://schemas.openxmlformats.org/drawingml/2006/main">
+              <a:graphicData uri="http://schemas.openxmlformats.org/drawingml/2006/picture">
+                <pic:pic xmlns:pic="http://schemas.openxmlformats.org/drawingml/2006/picture">
+                  <pic:nvPicPr>
+                    <pic:cNvPr id="0" name="" descr=""/>
+                    <pic:cNvPicPr>
+                      <a:picLocks noChangeAspect="1" noChangeArrowheads="1"/>
+                    </pic:cNvPicPr>
+                  </pic:nvPicPr>
+                  <pic:blipFill>
+                    <a:blip r:embed="rId8" cstate="none"/>
+                    <a:srcRect/>
+                    <a:stretch>
+                      <a:fillRect/>
+                    </a:stretch>
+                  </pic:blipFill>
+                  <pic:spPr bwMode="auto">
+                    <a:xfrm>
+                      <a:off x="0" y="0"/>
+                      <a:ext cx="4572000" cy="3981450"/>
+                    </a:xfrm>
+                    <a:prstGeom prst="rect">
+                      <a:avLst/>
+                    </a:prstGeom>
+                  </pic:spPr>
+                </pic:pic>
+              </a:graphicData>
+            </a:graphic>
+          </wp:inline>
+        </w:drawing>
+      </w:r>
+    </w:p>
+    <w:p>
+      <w:pPr>
+        <w:spacing w:after="120"/>
+      </w:pPr>
+      <w:r>
+        <w:rPr>
+          <w:i/>
+          <w:iCs/>
+          <w:color w:val="666666"/>
+          <w:sz w:val="18"/>
+          <w:szCs w:val="18"/>
+        </w:rPr>
+        <w:t xml:space="preserve">Figure 2. Sequence diagram — application scoring to review decision.</w:t>
+      </w:r>
+    </w:p>
+    <w:p>
+      <w:pPr>
+        <w:pStyle w:val="Heading1"/>
+        <w:spacing w:after="150" w:before="300"/>
+      </w:pPr>
+      <w:r>
+        <w:t xml:space="preserve">5. Prototype &amp; Evaluation (MVP)</w:t>
+      </w:r>
+    </w:p>
+    <w:p>
+      <w:pPr>
+        <w:spacing w:after="120"/>
+      </w:pPr>
+      <w:r>
+        <w:t xml:space="preserve">A synthetic dataset (8,000 records, ~14.8% base default rate) was generated to mirror the attributes above, and a baseline logistic regression scoring model was built to validate the analytical approach before proposing it to the AI Engineering team for a production-grade model (e.g., gradient boosting on Databricks/SageMaker).</w:t>
+      </w:r>
+    </w:p>
+    <w:tbl>
+      <w:tblPr>
+        <w:tblW w:type="dxa" w:w="11000"/>
+        <w:tblBorders>
+          <w:top w:val="single" w:color="auto" w:sz="4"/>
+          <w:left w:val="single" w:color="auto" w:sz="4"/>
+          <w:bottom w:val="single" w:color="auto" w:sz="4"/>
+          <w:right w:val="single" w:color="auto" w:sz="4"/>
+          <w:insideH w:val="single" w:color="auto" w:sz="4"/>
+          <w:insideV w:val="single" w:color="auto" w:sz="4"/>
+        </w:tblBorders>
+      </w:tblPr>
+      <w:tblGrid>
+        <w:gridCol w:w="2600"/>
+        <w:gridCol w:w="2600"/>
+        <w:gridCol w:w="5800"/>
+      </w:tblGrid>
+      <w:tr>
+        <w:tc>
+          <w:tcPr>
+            <w:tcW w:type="dxa" w:w="2600"/>
+            <w:shd w:fill="1F2A44" w:val="clear"/>
+          </w:tcPr>
+          <w:p>
+            <w:r>
+              <w:rPr>
+                <w:b/>
+                <w:bCs/>
+                <w:color w:val="FFFFFF"/>
+                <w:sz w:val="20"/>
+                <w:szCs w:val="20"/>
+              </w:rPr>
+              <w:t xml:space="preserve">Metric</w:t>
+            </w:r>
+          </w:p>
+        </w:tc>
+        <w:tc>
+          <w:tcPr>
+            <w:tcW w:type="dxa" w:w="2600"/>
+            <w:shd w:fill="1F2A44" w:val="clear"/>
+          </w:tcPr>
+          <w:p>
+            <w:r>
+              <w:rPr>
+                <w:b/>
+                <w:bCs/>
+                <w:color w:val="FFFFFF"/>
+                <w:sz w:val="20"/>
+                <w:szCs w:val="20"/>
+              </w:rPr>
+              <w:t xml:space="preserve">Result</w:t>
+            </w:r>
+          </w:p>
+        </w:tc>
+        <w:tc>
+          <w:tcPr>
+            <w:tcW w:type="dxa" w:w="5800"/>
+            <w:shd w:fill="1F2A44" w:val="clear"/>
+          </w:tcPr>
+          <w:p>
+            <w:r>
+              <w:rPr>
+                <w:b/>
+                <w:bCs/>
+                <w:color w:val="FFFFFF"/>
+                <w:sz w:val="20"/>
+                <w:szCs w:val="20"/>
+              </w:rPr>
+              <w:t xml:space="preserve">Business interpretation</w:t>
+            </w:r>
+          </w:p>
+        </w:tc>
+      </w:tr>
+      <w:tr>
+        <w:tc>
+          <w:tcPr>
+            <w:tcW w:type="dxa" w:w="2600"/>
+          </w:tcPr>
+          <w:p>
+            <w:r>
+              <w:rPr>
+                <w:b w:val="false"/>
+                <w:bCs w:val="false"/>
+                <w:sz w:val="20"/>
+                <w:szCs w:val="20"/>
+              </w:rPr>
+              <w:t xml:space="preserve">AUC (test set)</w:t>
+            </w:r>
+          </w:p>
+        </w:tc>
+        <w:tc>
+          <w:tcPr>
+            <w:tcW w:type="dxa" w:w="2600"/>
+          </w:tcPr>
+          <w:p>
+            <w:r>
+              <w:rPr>
+                <w:b w:val="false"/>
+                <w:bCs w:val="false"/>
+                <w:sz w:val="20"/>
+                <w:szCs w:val="20"/>
+              </w:rPr>
+              <w:t xml:space="preserve">0.6742</w:t>
+            </w:r>
+          </w:p>
+        </w:tc>
+        <w:tc>
+          <w:tcPr>
+            <w:tcW w:type="dxa" w:w="5800"/>
+          </w:tcPr>
+          <w:p>
+            <w:r>
+              <w:rPr>
+                <w:b w:val="false"/>
+                <w:bCs w:val="false"/>
+                <w:sz w:val="20"/>
+                <w:szCs w:val="20"/>
+              </w:rPr>
+              <w:t xml:space="preserve">Model ranks risk meaningfully better than random (0.5); acceptable for an MVP baseline, expected to improve with real data + richer features</w:t>
+            </w:r>
+          </w:p>
+        </w:tc>
+      </w:tr>
+      <w:tr>
+        <w:tc>
+          <w:tcPr>
+            <w:tcW w:type="dxa" w:w="2600"/>
+          </w:tcPr>
+          <w:p>
+            <w:r>
+              <w:rPr>
+                <w:b w:val="false"/>
+                <w:bCs w:val="false"/>
+                <w:sz w:val="20"/>
+                <w:szCs w:val="20"/>
+              </w:rPr>
+              <w:t xml:space="preserve">Review threshold</w:t>
+            </w:r>
+          </w:p>
+        </w:tc>
+        <w:tc>
+          <w:tcPr>
+            <w:tcW w:type="dxa" w:w="2600"/>
+          </w:tcPr>
+          <w:p>
+            <w:r>
+              <w:rPr>
+                <w:b w:val="false"/>
+                <w:bCs w:val="false"/>
+                <w:sz w:val="20"/>
+                <w:szCs w:val="20"/>
+              </w:rPr>
+              <w:t xml:space="preserve">Top 15% of scores</w:t>
+            </w:r>
+          </w:p>
+        </w:tc>
+        <w:tc>
+          <w:tcPr>
+            <w:tcW w:type="dxa" w:w="5800"/>
+          </w:tcPr>
+          <w:p>
+            <w:r>
+              <w:rPr>
+                <w:b w:val="false"/>
+                <w:bCs w:val="false"/>
+                <w:sz w:val="20"/>
+                <w:szCs w:val="20"/>
+              </w:rPr>
+              <w:t xml:space="preserve">Sized to match credit ops' current manual-review capacity</w:t>
+            </w:r>
+          </w:p>
+        </w:tc>
+      </w:tr>
+      <w:tr>
+        <w:tc>
+          <w:tcPr>
+            <w:tcW w:type="dxa" w:w="2600"/>
+          </w:tcPr>
+          <w:p>
+            <w:r>
+              <w:rPr>
+                <w:b w:val="false"/>
+                <w:bCs w:val="false"/>
+                <w:sz w:val="20"/>
+                <w:szCs w:val="20"/>
+              </w:rPr>
+              <w:t xml:space="preserve">Precision (flagged)</w:t>
+            </w:r>
+          </w:p>
+        </w:tc>
+        <w:tc>
+          <w:tcPr>
+            <w:tcW w:type="dxa" w:w="2600"/>
+          </w:tcPr>
+          <w:p>
+            <w:r>
+              <w:rPr>
+                <w:b w:val="false"/>
+                <w:bCs w:val="false"/>
+                <w:sz w:val="20"/>
+                <w:szCs w:val="20"/>
+              </w:rPr>
+              <w:t xml:space="preserve">0.29</w:t>
+            </w:r>
+          </w:p>
+        </w:tc>
+        <w:tc>
+          <w:tcPr>
+            <w:tcW w:type="dxa" w:w="5800"/>
+          </w:tcPr>
+          <w:p>
+            <w:r>
+              <w:rPr>
+                <w:b w:val="false"/>
+                <w:bCs w:val="false"/>
+                <w:sz w:val="20"/>
+                <w:szCs w:val="20"/>
+              </w:rPr>
+              <w:t xml:space="preserve">~29% of flagged cases are true defaulters — informs expected 'false alarm' rate for ops planning</w:t>
+            </w:r>
+          </w:p>
+        </w:tc>
+      </w:tr>
+      <w:tr>
+        <w:tc>
+          <w:tcPr>
+            <w:tcW w:type="dxa" w:w="2600"/>
+          </w:tcPr>
+          <w:p>
+            <w:r>
+              <w:rPr>
+                <w:b w:val="false"/>
+                <w:bCs w:val="false"/>
+                <w:sz w:val="20"/>
+                <w:szCs w:val="20"/>
+              </w:rPr>
+              <w:t xml:space="preserve">Recall (flagged)</w:t>
+            </w:r>
+          </w:p>
+        </w:tc>
+        <w:tc>
+          <w:tcPr>
+            <w:tcW w:type="dxa" w:w="2600"/>
+          </w:tcPr>
+          <w:p>
+            <w:r>
+              <w:rPr>
+                <w:b w:val="false"/>
+                <w:bCs w:val="false"/>
+                <w:sz w:val="20"/>
+                <w:szCs w:val="20"/>
+              </w:rPr>
+              <w:t xml:space="preserve">0.294</w:t>
+            </w:r>
+          </w:p>
+        </w:tc>
+        <w:tc>
+          <w:tcPr>
+            <w:tcW w:type="dxa" w:w="5800"/>
+          </w:tcPr>
+          <w:p>
+            <w:r>
+              <w:rPr>
+                <w:b w:val="false"/>
+                <w:bCs w:val="false"/>
+                <w:sz w:val="20"/>
+                <w:szCs w:val="20"/>
+              </w:rPr>
+              <w:t xml:space="preserve">~29% of actual defaulters are caught by the review queue at this threshold — a lever to negotiate with Risk (raise threshold = catch more, review more)</w:t>
+            </w:r>
+          </w:p>
+        </w:tc>
+      </w:tr>
+    </w:tbl>
+    <w:p>
+      <w:pPr>
+        <w:spacing w:after="120"/>
+      </w:pPr>
+      <w:r>
+        <w:t xml:space="preserve"/>
+      </w:r>
+    </w:p>
+    <w:p>
+      <w:pPr>
+        <w:spacing w:after="120"/>
+      </w:pPr>
+      <w:r>
+        <w:t xml:space="preserve">Key risk drivers (model coefficients, directional — for stakeholder explainability, not final production weights):</w:t>
+      </w:r>
+    </w:p>
+    <w:p>
+      <w:pPr>
+        <w:pStyle w:val="ListParagraph"/>
+        <w:numPr>
+          <w:ilvl w:val="0"/>
+          <w:numId w:val="2"/>
+        </w:numPr>
+        <w:spacing w:after="80"/>
+      </w:pPr>
+      <w:r>
+        <w:t xml:space="preserve">Debt-to-income ratio: +1.058 (strongest positive driver)</w:t>
+      </w:r>
+    </w:p>
+    <w:p>
+      <w:pPr>
+        <w:pStyle w:val="ListParagraph"/>
+        <w:numPr>
+          <w:ilvl w:val="0"/>
+          <w:numId w:val="2"/>
+        </w:numPr>
+        <w:spacing w:after="80"/>
+      </w:pPr>
+      <w:r>
+        <w:t xml:space="preserve">Credit utilization: +0.831</w:t>
+      </w:r>
+    </w:p>
+    <w:p>
+      <w:pPr>
+        <w:pStyle w:val="ListParagraph"/>
+        <w:numPr>
+          <w:ilvl w:val="0"/>
+          <w:numId w:val="2"/>
+        </w:numPr>
+        <w:spacing w:after="80"/>
+      </w:pPr>
+      <w:r>
+        <w:t xml:space="preserve">Late payments (12m): +0.492</w:t>
+      </w:r>
+    </w:p>
+    <w:p>
+      <w:pPr>
+        <w:pStyle w:val="ListParagraph"/>
+        <w:numPr>
+          <w:ilvl w:val="0"/>
+          <w:numId w:val="2"/>
+        </w:numPr>
+        <w:spacing w:after="80"/>
+      </w:pPr>
+      <w:r>
+        <w:t xml:space="preserve">Number of existing loans: +0.264</w:t>
+      </w:r>
+    </w:p>
+    <w:p>
+      <w:pPr>
+        <w:pStyle w:val="ListParagraph"/>
+        <w:numPr>
+          <w:ilvl w:val="0"/>
+          <w:numId w:val="2"/>
+        </w:numPr>
+        <w:spacing w:after="80"/>
+      </w:pPr>
+      <w:r>
+        <w:t xml:space="preserve">Monthly income: -0.126 (higher income associated with lower risk)</w:t>
+      </w:r>
+    </w:p>
+    <w:p>
+      <w:pPr>
+        <w:spacing w:after="100" w:before="200"/>
+      </w:pPr>
+      <w:r>
+        <w:drawing>
+          <wp:inline distT="0" distB="0" distL="0" distR="0">
+            <wp:extent cx="4762500" cy="3057525"/>
+            <wp:effectExtent t="0" r="0" b="0" l="0"/>
+            <wp:docPr id="1" name="" descr="" title=""/>
+            <wp:cNvGraphicFramePr>
+              <a:graphicFrameLocks xmlns:a="http://schemas.openxmlformats.org/drawingml/2006/main" noChangeAspect="1"/>
+            </wp:cNvGraphicFramePr>
+            <a:graphic xmlns:a="http://schemas.openxmlformats.org/drawingml/2006/main">
+              <a:graphicData uri="http://schemas.openxmlformats.org/drawingml/2006/picture">
+                <pic:pic xmlns:pic="http://schemas.openxmlformats.org/drawingml/2006/picture">
+                  <pic:nvPicPr>
+                    <pic:cNvPr id="0" name="" descr=""/>
+                    <pic:cNvPicPr>
+                      <a:picLocks noChangeAspect="1" noChangeArrowheads="1"/>
+                    </pic:cNvPicPr>
+                  </pic:nvPicPr>
+                  <pic:blipFill>
+                    <a:blip r:embed="rId9" cstate="none"/>
+                    <a:srcRect/>
+                    <a:stretch>
+                      <a:fillRect/>
+                    </a:stretch>
+                  </pic:blipFill>
+                  <pic:spPr bwMode="auto">
+                    <a:xfrm>
+                      <a:off x="0" y="0"/>
                       <a:ext cx="4762500" cy="3057525"/>
                     </a:xfrm>
                     <a:prstGeom prst="rect">
@@ -943,7 +1080,7 @@
         <w:spacing w:after="150" w:before="300"/>
       </w:pPr>
       <w:r>
-        <w:t xml:space="preserve">5. Limitations &amp; Risks (from a business lens)</w:t>
+        <w:t xml:space="preserve">6. Limitations &amp; Risks (from a business lens)</w:t>
       </w:r>
     </w:p>
     <w:p>
@@ -1004,7 +1141,7 @@
         <w:spacing w:after="150" w:before="300"/>
       </w:pPr>
       <w:r>
-        <w:t xml:space="preserve">6. KPI / Metrics Framework (Post-Deployment)</w:t>
+        <w:t xml:space="preserve">7. KPI / Metrics Framework (Post-Deployment)</w:t>
       </w:r>
     </w:p>
     <w:tbl>
@@ -1502,7 +1639,7 @@
         <w:spacing w:after="150" w:before="300"/>
       </w:pPr>
       <w:r>
-        <w:t xml:space="preserve">7. Stakeholders &amp; Handover Plan</w:t>
+        <w:t xml:space="preserve">8. Stakeholders &amp; Handover Plan</w:t>
       </w:r>
     </w:p>
     <w:p>

</xml_diff>

<commit_message>
Add author attribution (Kevin Ngo + LinkedIn) to site header/footer and case study docx cover pages
</commit_message>
<xml_diff>
--- a/Project1_Credit_Risk_Case_Study.docx
+++ b/Project1_Credit_Risk_Case_Study.docx
@@ -32,10 +32,7 @@
     </w:p>
     <w:p>
       <w:pPr>
-        <w:pBdr>
-          <w:bottom w:val="single" w:color="DDDDDD" w:sz="6" w:space="6"/>
-        </w:pBdr>
-        <w:spacing w:after="300"/>
+        <w:spacing w:after="60"/>
       </w:pPr>
       <w:r>
         <w:rPr>
@@ -47,6 +44,39 @@
         </w:rPr>
         <w:t xml:space="preserve">Portfolio demo — Business Data Analyst (AI Products) | Prepared by Kevin Ngo</w:t>
       </w:r>
+    </w:p>
+    <w:p>
+      <w:pPr>
+        <w:pBdr>
+          <w:bottom w:val="single" w:color="DDDDDD" w:sz="6" w:space="6"/>
+        </w:pBdr>
+        <w:spacing w:after="300"/>
+      </w:pPr>
+      <w:r>
+        <w:rPr>
+          <w:i/>
+          <w:iCs/>
+          <w:color w:val="888888"/>
+          <w:sz w:val="20"/>
+          <w:szCs w:val="20"/>
+        </w:rPr>
+        <w:t xml:space="preserve">Author: Kevin Ngo · </w:t>
+      </w:r>
+      <w:hyperlink w:history="1" r:id="rIdvuxfe-6y7uexi9nmzzjwf">
+        <w:r>
+          <w:rPr>
+            <w:b/>
+            <w:bCs/>
+            <w:i/>
+            <w:iCs/>
+            <w:color w:val="1F2A44"/>
+            <w:sz w:val="20"/>
+            <w:szCs w:val="20"/>
+            <w:u w:val="single"/>
+          </w:rPr>
+          <w:t xml:space="preserve">LinkedIn Profile</w:t>
+        </w:r>
+      </w:hyperlink>
     </w:p>
     <w:p>
       <w:pPr>

</xml_diff>